<commit_message>
v1.1.1: post-review reanalysis archive (multivariable Cox, BH-FDR recheck, ENCORI comparison, targeted circBank backfill)
</commit_message>
<xml_diff>
--- a/manuscript/SR_manuscript_EN.docx
+++ b/manuscript/SR_manuscript_EN.docx
@@ -4693,7 +4693,7 @@
           <w:i w:val="0"/>
           <w:sz w:val="24"/>
         </w:rPr>
-        <w:t>https://doi.org/10.5281/zenodo.23293108</w:t>
+        <w:t>https://doi.org/10.5281/zenodo.23293107</w:t>
       </w:r>
       <w:r>
         <w:rPr>
@@ -4702,7 +4702,7 @@
           <w:i w:val="0"/>
           <w:sz w:val="24"/>
         </w:rPr>
-        <w:t xml:space="preserve"> (version v1.0.0), which contains the result tables underlying every quantity reported here (candidate circRNA list, per-gene statistics in both cohorts, circBank matching table with match categories, the 15,479 network edges with quality scores and tier assignments, immune correlation tables, and the indirect-support analyses), together with the complete analysis pipeline, figure source files and 600 dpi renders, and the manuscript materials. The repository includes a MANIFEST with the SHA256 checksum of every file, a CITATION file, and a README documenting the execution order and the Python version required.</w:t>
+        <w:t>, which contains the result tables underlying every quantity reported here (candidate circRNA list, per-gene statistics in both cohorts, circBank matching table with match categories, the 15,479 network edges with quality scores and tier assignments, immune correlation tables, multivariable Cox model output, the false-discovery-rate recheck and the ENCORI comparison, and the indirect-support analyses), together with the complete analysis pipeline, figure source files and 600 dpi renders, and the manuscript materials. The repository includes a MANIFEST with the SHA256 checksum of every file, a CITATION file, and a README documenting the execution order and the software versions required.</w:t>
       </w:r>
     </w:p>
     <w:p>

</xml_diff>

<commit_message>
v1.1.2: corrected GSE14520 sex parsing reanalysis archive (multivariable Cox, BH-FDR recheck, ENCORI comparison, targeted circBank backfill)
</commit_message>
<xml_diff>
--- a/manuscript/SR_manuscript_EN.docx
+++ b/manuscript/SR_manuscript_EN.docx
@@ -14,7 +14,7 @@
           <w:i w:val="0"/>
           <w:sz w:val="32"/>
         </w:rPr>
-        <w:t>Host genes of differentially expressed circRNAs show consistent cross-cohort prognostic value in hepatocellular carcinoma</w:t>
+        <w:t>NT5DC2 is an independently prognostic host gene of differentially expressed circRNAs in hepatocellular carcinoma: a cross-cohort circRNA-miRNA-mRNA network analysis</w:t>
       </w:r>
     </w:p>
     <w:p>
@@ -122,7 +122,7 @@
           <w:i w:val="0"/>
           <w:sz w:val="24"/>
         </w:rPr>
-        <w:t xml:space="preserve"> in TCGA-LIHC (374 tumours) and GSE14520 (225 tumours). The circRNA–miRNA network comprised 15,479 deduplicated edges, 2,378 miRNAs, 79 circRNAs and 73 host genes. Of the host genes, 37 were significant in TCGA, 34 showed concordant direction across cohorts, and six passed independent validation. In multivariable Cox models adjusting for AJCC stage, age and sex, </w:t>
+        <w:t xml:space="preserve"> in TCGA-LIHC (374 tumours) and GSE14520 (225 tumours). The circRNA–miRNA network comprised 15,479 deduplicated edges, 2,378 miRNAs, 79 circRNAs and 73 host genes. Of the host genes, 37 were significant in TCGA and 34 of the 45 evaluable in both cohorts showed concordant direction (76%); six of these met the combined validation criterion. In multivariable Cox models adjusting for AJCC stage, age and sex, </w:t>
       </w:r>
       <w:r>
         <w:rPr>
@@ -140,7 +140,7 @@
           <w:i w:val="0"/>
           <w:sz w:val="24"/>
         </w:rPr>
-        <w:t xml:space="preserve"> (adjusted HR 1.22, P = 0.019; 1.27, P = 0.017); HSD17B6 reached significance in GSE14520 (0.80, P = 0.030) but not TCGA (P = 0.061); the remaining four were not significant after adjustment. Because neither cohort contains circRNA data and GSE122482 provides no matched mRNA quantification, </w:t>
+        <w:t xml:space="preserve"> (adjusted HR 1.22, P = 0.019; 1.27, P = 0.018); HSD17B6 reached significance in GSE14520 (0.80, P = 0.033) but not TCGA (P = 0.061); the remaining four were not significant after adjustment. Because neither cohort contains circRNA data and GSE122482 provides no matched mRNA quantification, </w:t>
       </w:r>
       <w:r>
         <w:rPr>
@@ -158,7 +158,7 @@
           <w:i w:val="0"/>
           <w:sz w:val="24"/>
         </w:rPr>
-        <w:t>. Benjamini–Hochberg correction across 92,204 features yielded 2 surviving candidates (FDR &lt; 0.05) versus 5,649 under uncorrected P &lt; 0.05. Comparison with ENCORI/starBase showed minimal overlap between prediction sources (Jaccard 0.000–0.035), indicating that connectivity-based support reflects internal consistency of one prediction resource rather than independent validation.</w:t>
+        <w:t>. Benjamini–Hochberg correction across all 92,204 tested features yielded 3 features at FDR &lt; 0.05, of which 2 belonged to the 103 candidates, against 5,649 features at uncorrected P &lt; 0.05. Comparison with ENCORI/starBase showed minimal overlap between prediction sources (Jaccard 0.000–0.035), indicating that connectivity-based support reflects internal consistency of one prediction resource rather than independent validation.</w:t>
       </w:r>
     </w:p>
     <w:p>
@@ -546,7 +546,7 @@
           <w:i w:val="0"/>
           <w:sz w:val="24"/>
         </w:rPr>
-        <w:t>In TCGA-LIHC, the expression of 37 host genes was significantly associated with overall survival (COX regression P &lt; 0.05), of which 25 were significant by both COX regression and the log-rank test.</w:t>
+        <w:t>In TCGA-LIHC, the expression of 37 host genes was significantly associated with overall survival (Cox regression P &lt; 0.05), of which 25 were significant by both Cox regression and the log-rank test.</w:t>
       </w:r>
     </w:p>
     <w:p>
@@ -560,7 +560,7 @@
           <w:i w:val="0"/>
           <w:sz w:val="24"/>
         </w:rPr>
-        <w:t>Independent evaluation in GSE14520 showed concordant direction for 34 genes (76%). Applying the criterion of concordant direction together with COX regression P &lt; 0.05 in GSE14520, six genes passed validation (Table 1).</w:t>
+        <w:t>Independent evaluation in GSE14520 was possible for 45 of the 87 host genes analysed in TCGA-LIHC. The 42 genes not evaluable in GSE14520 carry no probe on the GPL3921 array used for that cohort and are therefore absent from the comparison rather than missing at random; they are listed in the archived per-gene statistics. Among the 45 evaluable genes, concordant direction was seen for 34 (76%). Applying the criterion of concordant direction together with Cox regression P &lt; 0.05 in GSE14520, six genes passed validation (Table 1).</w:t>
       </w:r>
     </w:p>
     <w:p>
@@ -583,7 +583,7 @@
           <w:i w:val="0"/>
           <w:sz w:val="24"/>
         </w:rPr>
-        <w:t xml:space="preserve"> NT5DC2 and HSD17B6 were significant by COX regression in both cohorts and represent the strongest evidence in this study. BCLAF1, SREBF2, LRCH1 and CD5 did not reach significance by COX regression in TCGA (P = 0.086, 0.201, 0.092 and 0.063 respectively); these were included on the basis of significant COX regression in the validation cohort with concordant direction, and CD5 was additionally significant by the log-rank test in TCGA (P = 0.0019). Figure 3 shows the scatter distribution of hazard ratios in the two cohorts, with 34 paired genes lying close to the diagonal.</w:t>
+        <w:t xml:space="preserve"> NT5DC2 and HSD17B6 were significant by Cox regression in both cohorts and represent the strongest evidence in this study. BCLAF1, SREBF2, LRCH1 and CD5 did not reach significance by Cox regression in TCGA (P = 0.086, 0.201, 0.092 and 0.063 respectively); these were included on the basis of significant Cox regression in the validation cohort with concordant direction, and CD5 was additionally significant by the log-rank test in TCGA (P = 0.0019, against a Cox P of 0.063). Figure 3 shows the scatter distribution of hazard ratios in the two cohorts, with 34 paired genes lying close to the diagonal.</w:t>
       </w:r>
     </w:p>
     <w:p>
@@ -606,7 +606,7 @@
           <w:i w:val="0"/>
           <w:sz w:val="24"/>
         </w:rPr>
-        <w:t xml:space="preserve"> Higher HSD17B6 and LRCH1 expression was associated with better overall survival in both cohorts (protective), whereas the remaining four genes were associated with poorer outcome (Fig. 5).</w:t>
+        <w:t xml:space="preserve"> Higher expression of HSD17B6, CD5 and LRCH1 was associated with better overall survival in both cohorts (adjusted HR &lt; 1 in each), whereas higher NT5DC2 and BCLAF1 expression was associated with poorer outcome (adjusted HR &gt; 1 in each). SREBF2 is the one gene whose adjusted direction is not consistent between cohorts (TCGA-LIHC HR 0.98, GSE14520 HR 1.25); it was concordant in the unadjusted analysis but reverses after adjustment, and is therefore treated as directionally uncertain (Fig. 5, Table 1).</w:t>
       </w:r>
     </w:p>
     <w:p>
@@ -629,7 +629,7 @@
           <w:i w:val="0"/>
           <w:sz w:val="24"/>
         </w:rPr>
-        <w:t xml:space="preserve"> Because prognostic significance in TCGA alone could reflect confounding by clinical covariates, we fitted Cox models adjusting for AJCC stage (I/II vs III/IV), age (centred at 50 years) and sex, implemented in R with `survival::coxph` (Efron handling of ties). In TCGA-LIHC (n = 386, 145 events) and GSE14520 (n = 219, 84 events; all tumour samples are female, so sex was non-estimable and excluded) the adjusted results were:</w:t>
+        <w:t xml:space="preserve"> Because prognostic significance in TCGA alone could reflect confounding by clinical covariates, we fitted Cox models adjusting for AJCC stage (I/II vs III/IV), age (centred at 50 years) and sex, implemented in R with `survival::coxph` (Efron handling of ties). Both cohorts contain both sexes — 189 male and 30 female among the 219 GSE14520 cases analysed, and 258 male and 128 female among the 386 TCGA-LIHC cases analysed — so sex entered every model as a covariate. In TCGA-LIHC (n = 386, 145 events) and GSE14520 (n = 219, 84 events) the adjusted results were:</w:t>
       </w:r>
     </w:p>
     <w:p>
@@ -643,7 +643,7 @@
           <w:i w:val="0"/>
           <w:sz w:val="24"/>
         </w:rPr>
-        <w:t xml:space="preserve">Stage was a strong prognostic factor in both cohorts (adjusted HR 1.72, P = 0.0019 in TCGA; 3.24, P = 4.8 × 10⁻⁷ in GSE14520), confirming that adjustment was informative. </w:t>
+        <w:t xml:space="preserve">Stage was a strong prognostic factor in both cohorts (adjusted HR 1.72, P = 0.0019 in TCGA; 3.14, P = 1.2 × 10⁻⁶ in GSE14520), confirming that adjustment was informative; sex was not a significant covariate in either cohort (TCGA P = 0.970; GSE14520 P = 0.430), so the prognostic signals below are not attributable to sex. </w:t>
       </w:r>
       <w:r>
         <w:rPr>
@@ -661,7 +661,7 @@
           <w:i w:val="0"/>
           <w:sz w:val="24"/>
         </w:rPr>
-        <w:t>, and its effect size changed little (unadjusted 1.25 to adjusted 1.22 in TCGA; 1.37 to 1.27 in GSE14520), indicating that its prognostic association is not attributable to stage, age or sex. BCLAF1, SREBF2, CD5 and LRCH1 lost significance after adjustment and should be described as directionally consistent only (see Section 3.4).</w:t>
+        <w:t>, and its effect size changed little (unadjusted 1.25 to adjusted 1.22 in TCGA; 1.37 to adjusted 1.27 in GSE14520). SREBF2 in GSE14520 lies exactly at the significance boundary (P = 0.050, 95% CI 1.00–1.55) and is therefore reported as not significant. BCLAF1, SREBF2, CD5 and LRCH1 lost significance after adjustment and should be described as directionally consistent only (see Section 3.4).</w:t>
       </w:r>
     </w:p>
     <w:p>
@@ -740,7 +740,7 @@
           <w:i w:val="0"/>
           <w:sz w:val="24"/>
         </w:rPr>
-        <w:t>, satisfying the criterion for 19 gene–cell pairs (Treg cells r = 0.812/0.463, CD4+ T cells r = 0.877, Tfh r = 0.870, effector CD4 r = 0.863, CD8 r = 0.816; first value TCGA, second GSE14520)</w:t>
+        <w:t>, satisfying the criterion for 19 gene–cell pairs. Throughout, correlation coefficients are given as a pair in the order TCGA-LIHC, GSE14520: Treg cells r = 0.812/0.463, CD4+ T cells r = 0.877/0.378, Tfh cells r = 0.870/0.362, effector CD4 r = 0.863/0.381, CD8 r = 0.816/0.268</w:t>
       </w:r>
     </w:p>
     <w:p>
@@ -791,7 +791,7 @@
           <w:i w:val="0"/>
           <w:sz w:val="24"/>
         </w:rPr>
-        <w:t xml:space="preserve"> with endothelial cells (r = 0.160/0.337) and memory CD8 cells (r = −0.243), </w:t>
+        <w:t xml:space="preserve"> with endothelial cells (r = 0.160/0.337) and memory CD8 cells (r = −0.243/−0.217), </w:t>
       </w:r>
       <w:r>
         <w:rPr>
@@ -981,7 +981,7 @@
           <w:i w:val="0"/>
           <w:sz w:val="24"/>
         </w:rPr>
-        <w:t xml:space="preserve">The dual character of CD5 is noteworthy: it was significant by COX regression in GSE14520 and by the log-rank test in TCGA, while its high expression correlated positively with several T-cell populations. Notably, CD5 has HR &lt; 1 in both cohorts, indicating that it is a </w:t>
+        <w:t xml:space="preserve">The dual character of CD5 is noteworthy: it was significant by Cox regression in GSE14520 and by the log-rank test in TCGA, while its high expression correlated positively with several T-cell populations. Notably, CD5 has HR &lt; 1 in both cohorts (unadjusted 0.877 and 0.818; adjusted 0.94 and 0.81), indicating that it is a </w:t>
       </w:r>
       <w:r>
         <w:rPr>
@@ -1041,7 +1041,7 @@
           <w:i w:val="0"/>
           <w:sz w:val="24"/>
         </w:rPr>
-        <w:t>Ranked by the number of connected circRNAs, the top eight hub miRNAs connect 19–22 distinct circRNAs and 18–21 distinct host genes, with mean binding free energies mostly below −22 kcal/mol, indicating relatively strong predicted binding (Supplementary Table S1; Fig. 6).</w:t>
+        <w:t>Ranked over the complete network (all quality tiers) by the number of connected circRNAs, the top eight hub miRNAs connect 19–22 distinct circRNAs and 18–21 distinct host genes, with mean binding free energies mostly below −22 kcal/mol, indicating relatively strong predicted binding (Supplementary Table S1). Figure 6 ranks hubs within the high and medium tiers only, so its sixteen displayed miRNAs are a different and slightly smaller set; this is a deliberate difference in scope, not a discrepancy.</w:t>
       </w:r>
     </w:p>
     <w:p>
@@ -1128,7 +1128,7 @@
           <w:i w:val="0"/>
           <w:sz w:val="24"/>
         </w:rPr>
-        <w:t xml:space="preserve"> All edges in our network originate from a single prediction resource (circBank), whose human entries carry no quality annotations (the `highConfidence`, `validated` and `conserved` fields are empty for all 95 matched records). If circBank's seed matching is permissive, a miRNA that is broadly permissive will connect many genes by construction, and connectivity would then reflect the predictor rather than biology. We compared our predictions with ENCORI/starBase, which integrates seven independent algorithms (PITA, RNA22, miRmap, microT, miRanda, PicTar, TargetScan) together with CLIP-seq and degradome-seq evidence (accessed 11 November 2026):</w:t>
+        <w:t xml:space="preserve"> All edges in our network originate from a single prediction resource (circBank), whose human entries carry no quality annotations (the `highConfidence`, `validated` and `conserved` fields are empty for every matched human record we retrieved). If circBank's seed matching is permissive, a miRNA that is broadly permissive will connect many genes by construction, and connectivity would then reflect the predictor rather than biology. We compared our predictions with ENCORI/starBase, which integrates seven independent algorithms (PITA, RNA22, miRmap, microT, miRanda, PicTar, TargetScan) together with CLIP-seq and degradome-seq evidence (accessed 11 October 2026):</w:t>
       </w:r>
     </w:p>
     <w:p>
@@ -1257,7 +1257,7 @@
           <w:i w:val="0"/>
           <w:sz w:val="24"/>
         </w:rPr>
-        <w:t xml:space="preserve"> GSE122482 uses `chrN` whereas circBank uses `N`; these cannot be compared directly. Without harmonisation, only 33 of 103 candidate circRNAs could be matched to circBank entries at exact coordinates (32%). Normalising chromosome names raised the matching rate to 92% (exact 33, loose 18, gene_fallback 44). This was the single largest technical determinant of matching success in this study.</w:t>
+        <w:t xml:space="preserve"> GSE122482 uses `chrN` whereas circBank uses `N`; these cannot be compared directly. Without harmonisation, only 33 of 103 candidate circRNAs could be matched to circBank entries at exact coordinates (32%). Normalising chromosome names raised coordinate-level matching to 49 of 103 (48%: 34 exact and 15 loose), and a further 30 candidates were recovered by same-gene same-chromosome fallback matching, giving 79 circRNAs that carry at least one predicted miRNA and therefore enter the network. This was the single largest technical determinant of matching success in this study. The remaining 24 candidates are absent from the network because circBank declares either no entry at a comparable coordinate or no miRNA for any entry it does declare; the per-candidate reason is retained in the archived matching table.</w:t>
       </w:r>
     </w:p>
     <w:p>
@@ -1280,7 +1280,7 @@
           <w:i w:val="0"/>
           <w:sz w:val="24"/>
         </w:rPr>
-        <w:t xml:space="preserve"> Our initial retrieval covered 1,925 of 2,448 result pages (79%), and inspection of the coverage against the database showed that five circRNA entries with declared miRNA predictions had been missed, among them the entries for HSD17B6 and for circADAMTS13. After targeted re-retrieval (976 additional edges, with declared and retrieved counts agreeing entry by entry) the network grew from 14,568 to 15,479 edges, from 74 to 79 circRNAs and from 69 to 73 host genes. All figures reported here are derived from the completed dataset. A further 14 of the 95 matched entries carry no miRNA prediction in circBank at all and are therefore legitimately absent from the network.</w:t>
+        <w:t xml:space="preserve"> Our initial retrieval covered 1,925 of 2,448 result pages (79%), and inspection of the coverage against the database showed that five circRNA entries with declared miRNA predictions had been missed, among them the entries for HSD17B6 and for circADAMTS13. After targeted re-retrieval (976 additional edges, with declared and retrieved counts agreeing entry by entry) the network grew from 14,568 to 15,479 edges, from 74 to 79 circRNAs and from 69 to 73 host genes. All figures reported here are derived from the completed dataset.</w:t>
       </w:r>
     </w:p>
     <w:p>
@@ -1368,7 +1368,7 @@
           <w:i w:val="0"/>
           <w:sz w:val="24"/>
         </w:rPr>
-        <w:t xml:space="preserve"> Of 37 prognostic genes in TCGA, 34 showed concordant direction in GSE14520 (76%), and six met the combined criterion of concordant direction plus significant COX regression in the validation cohort. After adjustment for AJCC stage, age and sex, </w:t>
+        <w:t xml:space="preserve"> Of 37 prognostic genes in TCGA, 34 showed concordant direction in GSE14520 (76%), and six met the combined criterion of concordant direction plus significant Cox regression in the validation cohort. After adjustment for AJCC stage, age and sex, </w:t>
       </w:r>
       <w:r>
         <w:rPr>
@@ -1409,7 +1409,7 @@
           <w:i w:val="0"/>
           <w:sz w:val="24"/>
         </w:rPr>
-        <w:t xml:space="preserve"> circBank does not populate the commonly used `highConfidence`, `validated` and `conserved` fields for human entries (100% empty in our 95 matched entries); coordinate systems differ systematically between sources; our own initial retrieval was incomplete. We addressed these by match-type stratification, binding-energy filtering, chromatic harmonisation and completed re-retrieval, and we report the residual uncertainty explicitly. However, comparison with an independent resource (ENCORI/starBase, seven algorithms plus CLIP-seq and degradome-seq evidence) showed a Jaccard overlap of only 0.000–0.035 with our predictions. </w:t>
+        <w:t xml:space="preserve"> circBank does not populate the commonly used `highConfidence`, `validated` and `conserved` fields for human entries (100% empty in every matched record we retrieved); coordinate systems differ systematically between sources; our own initial retrieval was incomplete. We addressed these by match-type stratification, binding-energy filtering, chromosomal harmonisation and completed re-retrieval, and we report the residual uncertainty explicitly. However, comparison with an independent resource (ENCORI/starBase, seven algorithms plus CLIP-seq and degradome-seq evidence) showed a Jaccard overlap of only 0.000–0.035 with our predictions. </w:t>
       </w:r>
       <w:r>
         <w:rPr>
@@ -2138,7 +2138,7 @@
                 <w:b w:val="0"/>
                 <w:sz w:val="20"/>
               </w:rPr>
-              <w:t>circRNA expression microarray</w:t>
+              <w:t>circRNA expression microarray, GPL21290</w:t>
             </w:r>
           </w:p>
         </w:tc>
@@ -2216,7 +2216,7 @@
                 <w:b w:val="0"/>
                 <w:sz w:val="20"/>
               </w:rPr>
-              <w:t>RNA-seq + clinical</w:t>
+              <w:t>RNA-seq (FPKM) + clinical</w:t>
             </w:r>
           </w:p>
         </w:tc>
@@ -2294,7 +2294,7 @@
                 <w:b w:val="0"/>
                 <w:sz w:val="20"/>
               </w:rPr>
-              <w:t>GPL3921 + clinical</w:t>
+              <w:t>Affymetrix GPL3921 + Extra Supplement clinical</w:t>
             </w:r>
           </w:p>
         </w:tc>
@@ -2501,11 +2501,29 @@
       <w:r>
         <w:rPr>
           <w:rFonts w:ascii="Times New Roman" w:hAnsi="Times New Roman"/>
+          <w:b/>
+          <w:i w:val="0"/>
+          <w:sz w:val="24"/>
+        </w:rPr>
+        <w:t>Genome builds and coordinate harmonisation.</w:t>
+      </w:r>
+      <w:r>
+        <w:rPr>
+          <w:rFonts w:ascii="Times New Roman" w:hAnsi="Times New Roman"/>
           <w:b w:val="0"/>
           <w:i w:val="0"/>
           <w:sz w:val="24"/>
         </w:rPr>
-        <w:t>Clinical data for GSE14520 were obtained from its Extra Supplement file, and only tumour samples were included. Immune cell feature gene sets were taken from the pan-cancer immunogenomic analysis of Charoentaneath and colleagues</w:t>
+        <w:t xml:space="preserve"> GSE122482 reports circRNA coordinates in `chrN:start-end` notation (platform GPL21290) whereas circBank entries are written as `N:start-end`. Neither source states its genome build explicitly in the files we retrieved, so we could not verify that they are identical; </w:t>
+      </w:r>
+      <w:r>
+        <w:rPr>
+          <w:rFonts w:ascii="Times New Roman" w:hAnsi="Times New Roman"/>
+          <w:b/>
+          <w:i w:val="0"/>
+          <w:sz w:val="24"/>
+        </w:rPr>
+        <w:t>no liftOver between builds was performed</w:t>
       </w:r>
       <w:r>
         <w:rPr>
@@ -2513,18 +2531,8 @@
           <w:b w:val="0"/>
           <w:i w:val="0"/>
           <w:sz w:val="24"/>
-          <w:vertAlign w:val="superscript"/>
-        </w:rPr>
-        <w:t>10</w:t>
-      </w:r>
-      <w:r>
-        <w:rPr>
-          <w:rFonts w:ascii="Times New Roman" w:hAnsi="Times New Roman"/>
-          <w:b w:val="0"/>
-          <w:i w:val="0"/>
-          <w:sz w:val="24"/>
-        </w:rPr>
-        <w:t>, from which 27 immune cell subsets evaluable in liver tissue were selected, using the representative genes reported therein.</w:t>
+        </w:rPr>
+        <w:t>, and matching relied on coordinate identity after normalising the chromosome prefix alone. Because the two builds cannot be confirmed to agree, we treat a build difference as one possible explanation both for the residual unmatched candidates and for the MGC50722 and ADAMTS13 annotation conflict discussed in Section 2.1, and we flag this as a limitation rather than a resolved question. Readers reproducing the matching should confirm the builds before treating any coordinate-level match as exact.</w:t>
       </w:r>
     </w:p>
     <w:p>
@@ -2534,6 +2542,62 @@
       <w:r>
         <w:rPr>
           <w:rFonts w:ascii="Times New Roman" w:hAnsi="Times New Roman"/>
+          <w:b/>
+          <w:i w:val="0"/>
+          <w:sz w:val="24"/>
+        </w:rPr>
+        <w:t>Expression preprocessing.</w:t>
+      </w:r>
+      <w:r>
+        <w:rPr>
+          <w:rFonts w:ascii="Times New Roman" w:hAnsi="Times New Roman"/>
+          <w:b w:val="0"/>
+          <w:i w:val="0"/>
+          <w:sz w:val="24"/>
+        </w:rPr>
+        <w:t xml:space="preserve"> For GSE122482, per-sample circRNA RPM tables were obtained from the GEO supplementary files (20 tables, one per sample) and used as delivered; no further normalisation was applied, and the same table set served both the differential screen and the annotation mapping. For GSE14520, Affymetrix probe-level values were taken from the GEO series matrix as delivered (log-transformed by the submitters) and collapsed to gene level by averaging probes mapping to the same gene symbol; no additional normalisation, batch correction or imputation was performed, and the cohort was analysed as a single batch because it comes from one series. For TCGA-LIHC, FPKM values for the 73 host genes were retrieved from the Genomic Data Commons via the harmonised STAR - Counts data set (`TCGA-LIHC.star_fpkm.tsv.gz`, Ensembl gene identifiers mapped to symbols) together with the corresponding clinical table, and log2-transformed (log2(FPKM + 1)) before z-scoring. Expression values entered all models as z-scores, so that hazard ratios are per standard deviation and are not affected by the different dynamic ranges of the three platforms. The 424 samples with expression data exceed the 399 with survival and covariate data, and the 386 entering multivariable models; this attrition reflects missing clinical fields rather than missing expression and is itemised in Supplementary Table S6.</w:t>
+      </w:r>
+    </w:p>
+    <w:p>
+      <w:pPr>
+        <w:spacing w:line="240" w:lineRule="auto" w:before="0" w:after="120"/>
+      </w:pPr>
+      <w:r>
+        <w:rPr>
+          <w:rFonts w:ascii="Times New Roman" w:hAnsi="Times New Roman"/>
+          <w:b w:val="0"/>
+          <w:i w:val="0"/>
+          <w:sz w:val="24"/>
+        </w:rPr>
+        <w:t>Clinical data for GSE14520 were obtained from its Extra Supplement file, in which tissue type, survival status and survival time are recorded alongside sex (`M`/`F`) and TNM stage; only samples annotated as tumour were included. Immune cell feature gene sets were taken from the pan-cancer immunogenomic analysis of Charoentong and colleagues</w:t>
+      </w:r>
+      <w:r>
+        <w:rPr>
+          <w:rFonts w:ascii="Times New Roman" w:hAnsi="Times New Roman"/>
+          <w:b w:val="0"/>
+          <w:i w:val="0"/>
+          <w:sz w:val="24"/>
+          <w:vertAlign w:val="superscript"/>
+        </w:rPr>
+        <w:t>10</w:t>
+      </w:r>
+      <w:r>
+        <w:rPr>
+          <w:rFonts w:ascii="Times New Roman" w:hAnsi="Times New Roman"/>
+          <w:b w:val="0"/>
+          <w:i w:val="0"/>
+          <w:sz w:val="24"/>
+        </w:rPr>
+        <w:t>, from which 27 lineage subsets evaluable in liver tissue were selected, using the representative genes reported therein.</w:t>
+      </w:r>
+    </w:p>
+    <w:p>
+      <w:pPr>
+        <w:spacing w:line="240" w:lineRule="auto" w:before="0" w:after="120"/>
+      </w:pPr>
+      <w:r>
+        <w:rPr>
+          <w:rFonts w:ascii="Times New Roman" w:hAnsi="Times New Roman"/>
           <w:b w:val="0"/>
           <w:i w:val="0"/>
           <w:sz w:val="24"/>
@@ -2689,7 +2753,7 @@
           <w:i w:val="0"/>
           <w:sz w:val="24"/>
         </w:rPr>
-        <w:t>circRNA identifiers follow the format `hsa_circ:chrN:start-end`. Host genes were assigned by genomic coordinate lookup, yielding 48,109 of 92,204 annotation records (52.2%) corresponding to 91 unique host genes.</w:t>
+        <w:t>circRNA identifiers follow the format `hsa_circ:chrN:start-end`. Host genes were assigned by genomic coordinate lookup against the platform annotation. Across the full set of 92,204 circRNA features, 48,109 records (52.2%) carried a gene assignment, spanning 11,048 distinct host genes. Restricting the same lookup to the 103 differentially expressed circRNAs returned a gene assignment for each, and these 103 circRNAs map to 91 distinct host genes; nine genes host more than one of the candidate circRNAs. It is this set of 91 genes, not the whole annotation, that enters the prognostic analysis below.</w:t>
       </w:r>
     </w:p>
     <w:p>
@@ -2785,7 +2849,7 @@
           <w:i w:val="0"/>
           <w:sz w:val="24"/>
         </w:rPr>
-        <w:t xml:space="preserve"> was defined as concordant direction together with P &lt; 0.05 by COX regression in GSE14520. It should be noted that this criterion does not require significance in TCGA; consequently, only NT5DC2 and HSD17B6 among the six validated genes achieved COX significance in both cohorts, while the TCGA COX P values for CD5, BCLAF1, LRCH1 and SREBF2 ranged from 0.063 to 0.201.</w:t>
+        <w:t xml:space="preserve"> was defined as concordant direction together with P &lt; 0.05 by Cox regression in GSE14520. It should be noted that this criterion does not require significance in TCGA; consequently, only NT5DC2 and HSD17B6 among the six validated genes achieved Cox significance in both cohorts, while the TCGA Cox P values for CD5, BCLAF1, LRCH1 and SREBF2 ranged from 0.063 to 0.201.</w:t>
       </w:r>
     </w:p>
     <w:p>
@@ -2822,7 +2886,7 @@
           <w:i w:val="0"/>
           <w:sz w:val="24"/>
         </w:rPr>
-        <w:t xml:space="preserve"> Cox proportional hazards models were additionally fitted including AJCC pathologic stage (I/II vs III/IV), age (centred at 50 years) and sex as covariates, using R `survival::coxph` with Efron handling of tied event times (survival times are recorded in months or days and contain many ties). In GSE14520 all 225 tumour samples are female, so sex has no variance and its coefficient is not estimable; that term was therefore omitted from the GSE14520 models and the omission is stated rather than silently applied. Covariates were required to be present for a sample to enter a model, giving n = 386 (145 events) in TCGA-LIHC and n = 219 (84 events) in GSE14520. Numerical verification: all univariable COX P values were recomputed with `survival::coxph` and compared with the pipeline's own implementation, with significance classification agreeing for 9 of 9 genes in TCGA-LIHC and 6 of 9 in GSE14520; the three disagreements are genes whose P values lay between 0.03 and 0.09 and which therefore changed category when the sample set narrowed by two.</w:t>
+        <w:t xml:space="preserve"> Cox proportional hazards models were additionally fitted including AJCC pathologic stage (I/II vs III/IV), age (centred at 50 years) and sex as covariates, using R `survival::coxph` with Efron handling of tied event times (survival times are recorded in months or days and contain many ties). For GSE14520 the clinical variables were read from the Extra Supplement file, in which sex is coded `M`/`F` and stage in the `TNM staging` column as I/II/IIIA/IIIB/IIIC/IV; samples with missing stage, missing age or missing sex were excluded rather than assigned to a default category. Covariates were required to be present for a sample to enter a model, giving n = 386 (145 events) in TCGA-LIHC and n = 219 (84 events) in GSE14520. Numerical verification: all univariable Cox P values were recomputed with `survival::coxph` and compared with the pipeline's own implementation on identical sample sets; significance classification agreed for 9 of 9 genes in TCGA-LIHC and 6 of 9 in GSE14520, the three disagreements being genes whose P values lay between 0.03 and 0.09 and whose category therefore changed when the analysis set narrowed from 225 to 219 samples.</w:t>
       </w:r>
     </w:p>
     <w:p>
@@ -2850,7 +2914,7 @@
           <w:i w:val="0"/>
           <w:sz w:val="24"/>
         </w:rPr>
-        <w:t>For each gene an immune infiltration score was constructed by taking the immune feature gene sets and computing, for every sample, the rank-transformed mean expression of each set (an ssGSEA-style score)</w:t>
+        <w:t>For each gene a cellular composition score was constructed by taking the 27 lineage feature gene sets defined for liver tissue in the pan-cancer immunogenomic analysis of Charoentong and colleagues</w:t>
       </w:r>
       <w:r>
         <w:rPr>
@@ -2860,7 +2924,7 @@
           <w:sz w:val="24"/>
           <w:vertAlign w:val="superscript"/>
         </w:rPr>
-        <w:t>12</w:t>
+        <w:t>10</w:t>
       </w:r>
       <w:r>
         <w:rPr>
@@ -2869,7 +2933,7 @@
           <w:i w:val="0"/>
           <w:sz w:val="24"/>
         </w:rPr>
-        <w:t>, an approach that captures coordinated expression of cell-type markers without requiring cell-level resolution</w:t>
+        <w:t xml:space="preserve"> and computing, for every sample, the mean of the within-sample expression ranks of the genes in each set (a rank-average signature score)</w:t>
       </w:r>
       <w:r>
         <w:rPr>
@@ -2888,7 +2952,25 @@
           <w:i w:val="0"/>
           <w:sz w:val="24"/>
         </w:rPr>
-        <w:t xml:space="preserve">. Pearson correlations between gene expression and each immune cell score were computed separately in TCGA-LIHC and GSE14520, and </w:t>
+        <w:t xml:space="preserve">, an approach that captures coordinated expression of lineage markers without requiring cell-level resolution. It is not ssGSEA: no ECDF-based enrichment weighting is applied, and we therefore do not describe it as such. </w:t>
+      </w:r>
+      <w:r>
+        <w:rPr>
+          <w:rFonts w:ascii="Times New Roman" w:hAnsi="Times New Roman"/>
+          <w:b/>
+          <w:i w:val="0"/>
+          <w:sz w:val="24"/>
+        </w:rPr>
+        <w:t>The 27 sets are lineage signatures rather than exclusively immune lineages</w:t>
+      </w:r>
+      <w:r>
+        <w:rPr>
+          <w:rFonts w:ascii="Times New Roman" w:hAnsi="Times New Roman"/>
+          <w:b w:val="0"/>
+          <w:i w:val="0"/>
+          <w:sz w:val="24"/>
+        </w:rPr>
+        <w:t xml:space="preserve">: besides lymphoid and myeloid populations they include endothelial cells, cancer-associated fibroblasts and fibroblasts, which we retained because these compartments shape the tumour microenvironment and because the same reference defines them. We refer to them collectively as lineage signatures throughout. Pearson correlations between gene expression and each lineage score were computed separately in TCGA-LIHC and GSE14520, and </w:t>
       </w:r>
       <w:r>
         <w:rPr>
@@ -3009,7 +3091,7 @@
           <w:sz w:val="24"/>
           <w:vertAlign w:val="superscript"/>
         </w:rPr>
-        <w:t>17</w:t>
+        <w:t>15</w:t>
       </w:r>
       <w:r>
         <w:rPr>
@@ -3018,7 +3100,16 @@
           <w:i w:val="0"/>
           <w:sz w:val="24"/>
         </w:rPr>
-        <w:t>, a database employing a nomenclature based on circRNA host genes</w:t>
+        <w:t xml:space="preserve">, a database employing a nomenclature based on circRNA host genes, and candidate circRNAs were associated with circBank entries by coordinate matching. </w:t>
+      </w:r>
+      <w:r>
+        <w:rPr>
+          <w:rFonts w:ascii="Times New Roman" w:hAnsi="Times New Roman"/>
+          <w:b/>
+          <w:i w:val="0"/>
+          <w:sz w:val="24"/>
+        </w:rPr>
+        <w:t>Note that GSE122482 uses the `chrN` format whereas circBank uses `N`</w:t>
       </w:r>
       <w:r>
         <w:rPr>
@@ -3026,36 +3117,8 @@
           <w:b w:val="0"/>
           <w:i w:val="0"/>
           <w:sz w:val="24"/>
-          <w:vertAlign w:val="superscript"/>
-        </w:rPr>
-        <w:t>17</w:t>
-      </w:r>
-      <w:r>
-        <w:rPr>
-          <w:rFonts w:ascii="Times New Roman" w:hAnsi="Times New Roman"/>
-          <w:b w:val="0"/>
-          <w:i w:val="0"/>
-          <w:sz w:val="24"/>
-        </w:rPr>
-        <w:t xml:space="preserve">, and candidate circRNAs were associated with circBank entries by coordinate matching. </w:t>
-      </w:r>
-      <w:r>
-        <w:rPr>
-          <w:rFonts w:ascii="Times New Roman" w:hAnsi="Times New Roman"/>
-          <w:b/>
-          <w:i w:val="0"/>
-          <w:sz w:val="24"/>
-        </w:rPr>
-        <w:t>Note that GSE122482 uses the `chr12` format whereas circBank uses `12`</w:t>
-      </w:r>
-      <w:r>
-        <w:rPr>
-          <w:rFonts w:ascii="Times New Roman" w:hAnsi="Times New Roman"/>
-          <w:b w:val="0"/>
-          <w:i w:val="0"/>
-          <w:sz w:val="24"/>
-        </w:rPr>
-        <w:t>; without harmonisation, coordinate matching fails, and normalising chromosome names raises the matching rate from 32% to 92%.</w:t>
+        </w:rPr>
+        <w:t>; without harmonisation, coordinate matching fails. Normalising chromosome names raised exact-coordinate matches from 33 of 103 candidates (32%) to 34, and adding the loose and gene-fallback tiers brought 79 candidates (77%) into the network.</w:t>
       </w:r>
     </w:p>
     <w:p>
@@ -3260,7 +3323,7 @@
           <w:i w:val="0"/>
           <w:sz w:val="24"/>
         </w:rPr>
-        <w:t xml:space="preserve"> All edges in this study derive from a single prediction resource (circBank), which supplies no quality flags for human entries; the `highConfidence`, `validated` and `conserved` fields are empty for all 95 matched records. Connectivity across loci therefore cannot distinguish a genuinely promiscuous interaction from a permissive prediction rule, and a hub-like miRNA is expected to score highly by construction. We tested this empirically against ENCORI/starBase</w:t>
+        <w:t xml:space="preserve"> All edges in this study derive from a single prediction resource (circBank), which supplies no quality flags for human entries; the `highConfidence`, `validated` and `conserved` fields are empty for every matched human record we retrieved. Connectivity across loci therefore cannot distinguish a genuinely promiscuous interaction from a permissive prediction rule, and a hub-like miRNA is expected to score highly by construction. We tested this empirically against ENCORI/starBase</w:t>
       </w:r>
       <w:r>
         <w:rPr>
@@ -3279,7 +3342,7 @@
           <w:i w:val="0"/>
           <w:sz w:val="24"/>
         </w:rPr>
-        <w:t>, which integrates seven independent prediction algorithms together with CLIP-seq and degradome-seq evidence, querying each gene separately and merging the results (accessed 11 November 2026). The overlap with our predictions was minimal (Jaccard 0.000–0.035 across the six validated genes), and circBank assigned many more miRNAs per gene than the independent resource. We consequently use this grading only to prioritise candidates for future work and do not present it as cross-validation; the term "indirect support" is used in this paper only in the sense of internal consistency.</w:t>
+        <w:t>, which integrates seven independent prediction algorithms together with CLIP-seq and degradome-seq evidence, querying each gene separately and merging the results (accessed 11 October 2026). The overlap with our predictions was minimal (Jaccard 0.000–0.035 across the six validated genes), and circBank assigned many more miRNAs per gene than the independent resource. We consequently use this grading only to prioritise candidates for future work and do not present it as cross-validation; the term "indirect support" is used in this paper only in the sense of internal consistency.</w:t>
       </w:r>
     </w:p>
     <w:p>
@@ -3367,7 +3430,7 @@
           <w:i w:val="0"/>
           <w:sz w:val="24"/>
         </w:rPr>
-        <w:t>: false discovery rates with `stats::p.adjust(method = "BH")`, Cox proportional hazards models and log-rank tests with `survival::coxph` and `survdiff` (Efron handling of ties), and Pearson correlation with `stats::cor`. COX regression P &lt; 0.05 was considered significant. FDR-adjusted screening results are reported alongside nominal ones (Section 4.2); because the number of candidate circRNAs is not the reason for the absence of correction—the number of tested features is—the original uncorrected threshold is presented as exploratory and the FDR result as the defensible statement. Numerical verification against an independent implementation of the univariable Cox model is reported in Section 4.4. All P values, hazard ratios, false discovery rates and correlation coefficients are computed values; no value in this manuscript was entered by hand.</w:t>
+        <w:t>: false discovery rates with `stats::p.adjust(method = "BH")`, Cox proportional hazards models and log-rank tests with `survival::coxph` and `survdiff` (Efron handling of ties), and Pearson correlation with `stats::cor`. Cox regression P &lt; 0.05 was considered significant. FDR-adjusted screening results are reported alongside nominal ones (Section 4.2); because the number of candidate circRNAs is not the reason for the absence of correction—the number of tested features is—the original uncorrected threshold is presented as exploratory and the FDR result as the defensible statement. Numerical verification against an independent implementation of the univariable Cox model is reported in Section 4.4. All P values, hazard ratios, false discovery rates and correlation coefficients are computed values; no value in this manuscript was entered by hand.</w:t>
       </w:r>
     </w:p>
     <w:p>
@@ -3395,7 +3458,7 @@
           <w:i w:val="0"/>
           <w:sz w:val="24"/>
         </w:rPr>
-        <w:t xml:space="preserve">HR is the hazard ratio per one-standard-deviation increase in expression. Unadjusted columns reproduce the initial single-cohort analysis; adjusted columns are from Cox models including AJCC stage, age and sex (sex omitted in GSE14520 because all tumour samples are female). </w:t>
+        <w:t xml:space="preserve">HR is the hazard ratio per one-standard-deviation increase in expression. Unadjusted columns reproduce the initial single-cohort analysis; adjusted columns are from Cox models including AJCC stage, age and sex, all of which were estimable in both cohorts. </w:t>
       </w:r>
       <w:r>
         <w:rPr>
@@ -3413,7 +3476,7 @@
           <w:i w:val="0"/>
           <w:sz w:val="24"/>
         </w:rPr>
-        <w:t>, and its adjusted effect size is close to its unadjusted value, indicating that the association is not attributable to the clinical covariates included. The remaining five genes should be read as directionally consistent across cohorts rather than as independently validated prognostic markers.</w:t>
+        <w:t>, and its adjusted effect size is close to its unadjusted value; sex was not a significant covariate in either cohort. The remaining five genes should be read as directionally consistent across cohorts rather than as independently validated prognostic markers.</w:t>
       </w:r>
     </w:p>
     <w:p>
@@ -3528,7 +3591,7 @@
           <w:i w:val="0"/>
           <w:sz w:val="24"/>
         </w:rPr>
-        <w:t xml:space="preserve"> Scatter plot comparing hazard ratios (per one standard deviation) for the same gene in TCGA-LIHC (n = 374) and GSE14520 (n = 225). The diagonal is the perfect-concordance reference; horizontal and vertical dashed lines mark HR = 1. Green points indicate concordant direction across cohorts (34/45, 76%); red points indicate opposite directions.</w:t>
+        <w:t xml:space="preserve"> Scatter plot comparing hazard ratios (per one standard deviation) for the 45 host genes evaluable in both cohorts, in TCGA-LIHC (n = 374) and GSE14520 (n = 225). The diagonal is the perfect-concordance reference; horizontal and vertical dashed lines mark HR = 1. Green points indicate concordant direction across cohorts (34/45, 76%); red points indicate opposite directions.</w:t>
       </w:r>
     </w:p>
     <w:p>
@@ -3574,7 +3637,7 @@
           <w:i w:val="0"/>
           <w:sz w:val="24"/>
         </w:rPr>
-        <w:t xml:space="preserve"> (a–c) NT5DC2, (d–f) HSD17B6, (g–i) LRCH1 and (j–l) CD5, shown in TCGA-LIHC and GSE14520. Groups were divided at median expression; red indicates the high-expression group and green the low-expression group, with group sizes, event counts and log-rank P values annotated. Higher NT5DC2 expression was associated with poorer survival in both cohorts; higher HSD17B6 expression was associated with better survival in GSE14520 (P = 0.007).</w:t>
+        <w:t xml:space="preserve"> (a–c) NT5DC2, (d–f) HSD17B6, (g–i) LRCH1 and (j–l) CD5, shown in TCGA-LIHC and GSE14520. Groups were divided at median expression; red indicates the high-expression group and green the low-expression group, with group sizes, event counts and log-rank P values annotated. Higher NT5DC2 expression was associated with poorer survival in both cohorts (TCGA log-rank P = 0.013; GSE14520 P = 0.005). Higher HSD17B6 expression was associated with better survival in GSE14520 (log-rank P = 0.007) but not significantly in TCGA (P = 0.067), consistent with its borderline multivariable result there. CD5 shows the reverse pattern: significant by log-rank in TCGA (P = 0.0019) but not in GSE14520 (P = 0.066), while its Cox P values are 0.063 and 0.030. LRCH1 is not significant by log-rank in either cohort (0.344 and 0.187). The two tests answer different questions — the log-rank test compares two median-split groups and is sensitive to differences in the shape of the survival curves, whereas the Cox model uses the continuous expression value and assumes proportional hazards — so a gene can be significant by one and not the other. We report both throughout and do not select between them.</w:t>
       </w:r>
     </w:p>
     <w:p>
@@ -3597,7 +3660,7 @@
           <w:i w:val="0"/>
           <w:sz w:val="24"/>
         </w:rPr>
-        <w:t xml:space="preserve"> The network includes only high and medium tier edges (3,960 edges). The centre contains the 16 hub miRNAs ranked by the number of connected circRNAs (node size = number of connected circRNAs; colour intensity reflects mean binding energy). The outer left ring shows 36 circRNAs and the outer right ring 34 host genes. Edge colour indicates tier (red = high, orange = medium). Gene node colour: dark red = prognostic direction concordant and significant in two independent cohorts; blue = TCGA P_cox &lt; 0.05; grey = not significant.</w:t>
+        <w:t xml:space="preserve"> The network includes only high and medium tier edges (4,540 edges: 3,126 high plus 1,414 medium). The centre contains the 16 hub miRNAs ranked by the number of connected circRNAs within these two tiers (node size = number of connected circRNAs; colour intensity reflects mean binding energy). The outer left ring shows the 37 circRNAs and the outer right ring the 34 host genes connected to those hubs. Edge colour indicates tier (red = high, orange = medium). Gene node colour: dark red = prognostic direction concordant and significant in two independent cohorts; blue = TCGA P_cox &lt; 0.05; grey = not significant.</w:t>
       </w:r>
     </w:p>
     <w:p>
@@ -3620,7 +3683,7 @@
           <w:i w:val="0"/>
           <w:sz w:val="24"/>
         </w:rPr>
-        <w:t xml:space="preserve"> (a) Edge counts by tier: high 3,126, medium 1,414, low 10,939. (b) Distinct miRNAs covered by each tier: 1,317 / 851 / 2,307. (c) Cross-cohort validated genes covered by each tier: 4 / 1 / 6. Stratification is based on coordinate matching confidence and binding free energy. The low tier covers all six validated genes because one of them, NT5DC2, could only be matched through same-gene same-chromosome fallback, whose coordinate reliability is lower.</w:t>
+        <w:t xml:space="preserve"> (a) Edge counts by tier: high 3,126, medium 1,414, low 10,939. (b) Distinct miRNAs covered by each tier: 1,317 / 851 / 2,307. (c) Cross-cohort validated genes covered by each tier: 4 / 1 / 6. Genes are counted once per tier in (c), so the three values sum to more than the six validated genes: a gene connected by edges of more than one quality tier appears in each of those tiers. Stratification is based on coordinate matching confidence and binding free energy. The low tier covers all six validated genes because one of them, NT5DC2, could only be matched through same-gene same-chromosome fallback, whose coordinate reliability is lower.</w:t>
       </w:r>
     </w:p>
     <w:p>
@@ -3801,7 +3864,7 @@
           <w:i w:val="0"/>
           <w:sz w:val="24"/>
         </w:rPr>
-        <w:t>Adjusted for AJCC stage (I/II vs III/IV), age (centred at 50 years) and sex; sex was omitted in GSE14520 because all 225 tumour samples are female. Fitted in R 4.6.1 with `survival::coxph` (Efron ties).</w:t>
+        <w:t>Adjusted for AJCC stage (I/II vs III/IV), age (centred at 50 years) and sex. All three covariates were estimable in both cohorts. Fitted in R 4.6.1 with `survival::coxph` (Efron ties).</w:t>
       </w:r>
     </w:p>
     <w:p>
@@ -3816,6 +3879,34 @@
           <w:sz w:val="24"/>
         </w:rPr>
         <w:t>Results for all six genes are given in the associated data archive.</w:t>
+      </w:r>
+    </w:p>
+    <w:p>
+      <w:pPr>
+        <w:spacing w:line="240" w:lineRule="auto" w:before="0" w:after="120"/>
+      </w:pPr>
+      <w:r>
+        <w:rPr>
+          <w:rFonts w:ascii="Times New Roman" w:hAnsi="Times New Roman"/>
+          <w:b/>
+          <w:i w:val="0"/>
+          <w:sz w:val="24"/>
+        </w:rPr>
+        <w:t>Supplementary Table S6 | Clinical characteristics of the two validation cohorts</w:t>
+      </w:r>
+    </w:p>
+    <w:p>
+      <w:pPr>
+        <w:spacing w:line="240" w:lineRule="auto" w:before="0" w:after="120"/>
+      </w:pPr>
+      <w:r>
+        <w:rPr>
+          <w:rFonts w:ascii="Times New Roman" w:hAnsi="Times New Roman"/>
+          <w:b w:val="0"/>
+          <w:i w:val="0"/>
+          <w:sz w:val="24"/>
+        </w:rPr>
+        <w:t>Sex and stage distributions of the GSE14520 cohort were verified directly against the Extra Supplement clinical file: sex is coded `M`/`F` (211 male and 31 female among all 247 tumour samples, 189/30 among the 219 entering the models) and stage in the `TNM staging` column (I, II, IIIA, IIIB, IIIC and IV grouped as I/II versus III/IV). Samples with missing sex, stage or age, or with non-positive survival time, were excluded rather than assigned a default value.</w:t>
       </w:r>
     </w:p>
     <w:p>
@@ -3943,7 +4034,7 @@
           <w:i w:val="0"/>
           <w:sz w:val="24"/>
         </w:rPr>
-        <w:t xml:space="preserve">4.  Enuka TF, Beukman CJ, Aoki M, et al. Circular RNAs are a large class of animal RNAs with significant splicing-independent function. </w:t>
+        <w:t xml:space="preserve">4.  Enuka Y, Lauriola M, Feldman ME, Sas-Chen A, Ulitsky I, Yarden Y. Circular RNAs are long-lived and display only minimal early alterations in response to a growth factor. </w:t>
       </w:r>
       <w:r>
         <w:rPr>
@@ -3952,7 +4043,7 @@
           <w:i/>
           <w:sz w:val="24"/>
         </w:rPr>
-        <w:t>Genes Dev.</w:t>
+        <w:t>Nucleic Acids Res.</w:t>
       </w:r>
       <w:r>
         <w:rPr>
@@ -3961,7 +4052,7 @@
           <w:i w:val="0"/>
           <w:sz w:val="24"/>
         </w:rPr>
-        <w:t xml:space="preserve"> 2016;30(3):255–267. doi:10.1101/gad.282022.116</w:t>
+        <w:t xml:space="preserve"> 2016;44(3):1370–1383. doi:10.1093/nar/gkv1367</w:t>
       </w:r>
     </w:p>
     <w:p>
@@ -4075,7 +4166,7 @@
           <w:i w:val="0"/>
           <w:sz w:val="24"/>
         </w:rPr>
-        <w:t xml:space="preserve">8.  Salmena L, Isis A, Pandolfi M. ceRNA: a long noncoding RNA hypothesis for cancer. </w:t>
+        <w:t xml:space="preserve">8.  Salmena L, Poliseno L, Tay Y, Kats L, Pandolfi PP. A ceRNA hypothesis: the Rosetta Stone of a hidden RNA language. </w:t>
       </w:r>
       <w:r>
         <w:rPr>
@@ -4084,7 +4175,7 @@
           <w:i/>
           <w:sz w:val="24"/>
         </w:rPr>
-        <w:t>Cancer Res.</w:t>
+        <w:t>Cell.</w:t>
       </w:r>
       <w:r>
         <w:rPr>
@@ -4093,7 +4184,7 @@
           <w:i w:val="0"/>
           <w:sz w:val="24"/>
         </w:rPr>
-        <w:t xml:space="preserve"> 2014;74(18):4915–4924. doi:10.1158/0008-5472.CAN-14-2466</w:t>
+        <w:t xml:space="preserve"> 2011;146(3):353–358. doi:10.1016/j.cell.2011.07.013</w:t>
       </w:r>
     </w:p>
     <w:p>
@@ -4150,7 +4241,7 @@
           <w:i w:val="0"/>
           <w:sz w:val="24"/>
         </w:rPr>
-        <w:t>Charoentaneath C, Alhadeff RA, Kanchi RR, et al. Pan-cancer immunogenomic analyses reveal genotype–immunophenotype relationships and predictors of response to checkpoint blockade. *Cell Rep.* 2017;18(1):329–354. doi:10.1016/j.celrep.2016.12.024</w:t>
+        <w:t>Charoentong C, Alhadeff RA, Kanchi RR, et al. Pan-cancer immunogenomic analyses reveal genotype–immunophenotype relationships and predictors of response to checkpoint blockade. *Cell Rep.* 2017;18(1):329–354. doi:10.1016/j.celrep.2016.12.024</w:t>
       </w:r>
     </w:p>
     <w:p>
@@ -4165,7 +4256,7 @@
           <w:i w:val="0"/>
           <w:sz w:val="24"/>
         </w:rPr>
-        <w:t xml:space="preserve">11.  Bindea G, Mohn F, et al. Assessing the tumor microenvironment from gene expression profiling: application to colorectal cancer. </w:t>
+        <w:t xml:space="preserve">11.  Bindea G, Mlecnik B, Galon J, et al. Assessing the tumor microenvironment from gene expression profiling: application to colorectal cancer. </w:t>
       </w:r>
       <w:r>
         <w:rPr>
@@ -4495,25 +4586,7 @@
           <w:i w:val="0"/>
           <w:sz w:val="24"/>
         </w:rPr>
-        <w:t xml:space="preserve"> 2021;12(10):920–936. doi:10.7150/jca.45890 </w:t>
-      </w:r>
-      <w:r>
-        <w:rPr>
-          <w:rFonts w:ascii="Times New Roman" w:hAnsi="Times New Roman"/>
-          <w:b/>
-          <w:i w:val="0"/>
-          <w:sz w:val="24"/>
-        </w:rPr>
-        <w:t>Huang ZL, Huang XY, Huang J, et al. Multiple omics integration reveals key circular RNAs in hepatocellular carcinoma. *J Cancer.* 2021;12(10):920–936. doi:10.7150/jca.45890</w:t>
-      </w:r>
-      <w:r>
-        <w:rPr>
-          <w:rFonts w:ascii="Times New Roman" w:hAnsi="Times New Roman"/>
-          <w:b w:val="0"/>
-          <w:i w:val="0"/>
-          <w:sz w:val="24"/>
-        </w:rPr>
-        <w:t>（同为 HCC circRNA 多组学研究，可作背景支撑）</w:t>
+        <w:t xml:space="preserve"> 2021;12(10):920–936. PMID:34094907</w:t>
       </w:r>
     </w:p>
     <w:p>
@@ -4528,7 +4601,7 @@
           <w:i w:val="0"/>
           <w:sz w:val="24"/>
         </w:rPr>
-        <w:t xml:space="preserve">22.  Zhou K, Huang J, Liu S, Zheng W, Liu S, Xing Y, Cao Y, Chen Y, et al. An encyclopedic regulatory and functional atlas of RNA Interactomes. </w:t>
+        <w:t xml:space="preserve">22.  Zhou K, Huang J, Liu S, et al. An encyclopedic regulatory and functional atlas of RNA Interactomes. </w:t>
       </w:r>
       <w:r>
         <w:rPr>
@@ -4546,103 +4619,7 @@
           <w:i w:val="0"/>
           <w:sz w:val="24"/>
         </w:rPr>
-        <w:t xml:space="preserve"> 2026;23(6):1109–1114. doi:10.1038/s41592-026-03105-x (ENCORI/starBase; accessed 11 November 2026)</w:t>
-      </w:r>
-    </w:p>
-    <w:p>
-      <w:pPr>
-        <w:spacing w:line="240" w:lineRule="auto" w:before="0" w:after="120"/>
-        <w:ind w:left="432"/>
-      </w:pPr>
-      <w:r>
-        <w:rPr>
-          <w:rFonts w:ascii="Times New Roman" w:hAnsi="Times New Roman"/>
-          <w:b w:val="0"/>
-          <w:i/>
-          <w:sz w:val="20"/>
-        </w:rPr>
-        <w:t xml:space="preserve">⚠️ </w:t>
-      </w:r>
-      <w:r>
-        <w:rPr>
-          <w:rFonts w:ascii="Times New Roman" w:hAnsi="Times New Roman"/>
-          <w:b/>
-          <w:i/>
-          <w:sz w:val="20"/>
-        </w:rPr>
-        <w:t>投稿前必须处理</w:t>
-      </w:r>
-      <w:r>
-        <w:rPr>
-          <w:rFonts w:ascii="Times New Roman" w:hAnsi="Times New Roman"/>
-          <w:b w:val="0"/>
-          <w:i/>
-          <w:sz w:val="20"/>
-        </w:rPr>
-        <w:t>：</w:t>
-      </w:r>
-    </w:p>
-    <w:p>
-      <w:pPr>
-        <w:spacing w:line="240" w:lineRule="auto" w:before="0" w:after="120"/>
-        <w:ind w:left="432"/>
-      </w:pPr>
-      <w:r>
-        <w:rPr>
-          <w:rFonts w:ascii="Times New Roman" w:hAnsi="Times New Roman"/>
-          <w:b w:val="0"/>
-          <w:i/>
-          <w:sz w:val="20"/>
-        </w:rPr>
-        <w:t xml:space="preserve">1. </w:t>
-      </w:r>
-      <w:r>
-        <w:rPr>
-          <w:rFonts w:ascii="Times New Roman" w:hAnsi="Times New Roman"/>
-          <w:b/>
-          <w:i/>
-          <w:sz w:val="20"/>
-        </w:rPr>
-        <w:t>参考文献 24（GSE122482 原始文献，PMID: 30537115）题录待补齐</w:t>
-      </w:r>
-      <w:r>
-        <w:rPr>
-          <w:rFonts w:ascii="Times New Roman" w:hAnsi="Times New Roman"/>
-          <w:b w:val="0"/>
-          <w:i/>
-          <w:sz w:val="20"/>
-        </w:rPr>
-        <w:t>——请按该 PMID 检索，补全作者、期刊、年份、卷期页。本刊要求元数据完整，这是唯一一条尚不完整的文献。</w:t>
-      </w:r>
-    </w:p>
-    <w:p>
-      <w:pPr>
-        <w:spacing w:line="240" w:lineRule="auto" w:before="0" w:after="120"/>
-        <w:ind w:left="432"/>
-      </w:pPr>
-      <w:r>
-        <w:rPr>
-          <w:rFonts w:ascii="Times New Roman" w:hAnsi="Times New Roman"/>
-          <w:b w:val="0"/>
-          <w:i/>
-          <w:sz w:val="20"/>
-        </w:rPr>
-        <w:t>2. 全部参考文献均已在正文引用，编号连续</w:t>
-      </w:r>
-    </w:p>
-    <w:p>
-      <w:pPr>
-        <w:spacing w:line="240" w:lineRule="auto" w:before="0" w:after="120"/>
-        <w:ind w:left="432"/>
-      </w:pPr>
-      <w:r>
-        <w:rPr>
-          <w:rFonts w:ascii="Times New Roman" w:hAnsi="Times New Roman"/>
-          <w:b w:val="0"/>
-          <w:i/>
-          <w:sz w:val="20"/>
-        </w:rPr>
-        <w:t>3. 投稿前请通读一遍全稿，确认表述与实际分析一致</w:t>
+        <w:t xml:space="preserve"> 2026;23(6):1109–1114. doi:10.1038/s41592-026-03105-x</w:t>
       </w:r>
     </w:p>
     <w:p>
@@ -4730,7 +4707,43 @@
           <w:i w:val="0"/>
           <w:sz w:val="24"/>
         </w:rPr>
-        <w:t>All analyses were implemented using the Python 3.13.12 standard library without third-party packages. As no commercial software packages were used, no licence purchase is required for complete reproduction.</w:t>
+        <w:t xml:space="preserve">The analysis was implemented in two stages and both are archived with the results. </w:t>
+      </w:r>
+      <w:r>
+        <w:rPr>
+          <w:rFonts w:ascii="Times New Roman" w:hAnsi="Times New Roman"/>
+          <w:b/>
+          <w:i w:val="0"/>
+          <w:sz w:val="24"/>
+        </w:rPr>
+        <w:t>Data retrieval, format handling and file processing</w:t>
+      </w:r>
+      <w:r>
+        <w:rPr>
+          <w:rFonts w:ascii="Times New Roman" w:hAnsi="Times New Roman"/>
+          <w:b w:val="0"/>
+          <w:i w:val="0"/>
+          <w:sz w:val="24"/>
+        </w:rPr>
+        <w:t xml:space="preserve"> were done in Python 3.13.12 using the standard library only, so this stage needs no third-party packages. </w:t>
+      </w:r>
+      <w:r>
+        <w:rPr>
+          <w:rFonts w:ascii="Times New Roman" w:hAnsi="Times New Roman"/>
+          <w:b/>
+          <w:i w:val="0"/>
+          <w:sz w:val="24"/>
+        </w:rPr>
+        <w:t>All statistical inference was done in R 4.6.1</w:t>
+      </w:r>
+      <w:r>
+        <w:rPr>
+          <w:rFonts w:ascii="Times New Roman" w:hAnsi="Times New Roman"/>
+          <w:b w:val="0"/>
+          <w:i w:val="0"/>
+          <w:sz w:val="24"/>
+        </w:rPr>
+        <w:t xml:space="preserve"> using `stats` (`p.adjust`, `cor`) and `survival` (`coxph`, `survdiff`); both ship with R and require no additional licence. Figure rendering additionally uses `Pillow` and a headless browser for SVG rasterisation, and is not required to reproduce any numerical result. The complete pipeline, the execution order and the software versions are documented in the archive README, and every file carries a SHA256 checksum in the archive manifest.</w:t>
       </w:r>
     </w:p>
     <w:p>
@@ -4956,7 +4969,7 @@
           <w:i w:val="0"/>
           <w:sz w:val="24"/>
         </w:rPr>
-        <w:t xml:space="preserve">: 7 figures and 1 table (limit 8). </w:t>
+        <w:t xml:space="preserve">: 7 figures and 1 main table, plus 6 supplementary tables. </w:t>
       </w:r>
       <w:r>
         <w:rPr>
@@ -4974,7 +4987,7 @@
           <w:i w:val="0"/>
           <w:sz w:val="24"/>
         </w:rPr>
-        <w:t>: 21.</w:t>
+        <w:t>: 22.</w:t>
       </w:r>
     </w:p>
     <w:p>
@@ -5177,7 +5190,7 @@
                 <w:b w:val="0"/>
                 <w:sz w:val="20"/>
               </w:rPr>
-              <w:t>1.27 (1.04–1.55), P = 0.017</w:t>
+              <w:t>1.27 (1.04–1.54), P = 0.018</w:t>
             </w:r>
           </w:p>
         </w:tc>
@@ -5255,7 +5268,7 @@
                 <w:b w:val="0"/>
                 <w:sz w:val="20"/>
               </w:rPr>
-              <w:t>0.80 (0.65–0.98), P = 0.030</w:t>
+              <w:t>0.80 (0.65–0.98), P = 0.033</w:t>
             </w:r>
           </w:p>
         </w:tc>
@@ -5333,7 +5346,7 @@
                 <w:b w:val="0"/>
                 <w:sz w:val="20"/>
               </w:rPr>
-              <w:t>1.19 (0.95–1.48), P = 0.133</w:t>
+              <w:t>1.20 (0.96–1.51), P = 0.114</w:t>
             </w:r>
           </w:p>
         </w:tc>
@@ -5411,7 +5424,7 @@
                 <w:b w:val="0"/>
                 <w:sz w:val="20"/>
               </w:rPr>
-              <w:t>1.24 (0.99–1.54), P = 0.058</w:t>
+              <w:t>1.25 (1.00–1.55), P = 0.050</w:t>
             </w:r>
           </w:p>
         </w:tc>
@@ -5430,7 +5443,7 @@
                 <w:b w:val="0"/>
                 <w:sz w:val="20"/>
               </w:rPr>
-              <w:t>No</w:t>
+              <w:t>No (CI lower bound 1.00; not significant)</w:t>
             </w:r>
           </w:p>
         </w:tc>
@@ -5489,7 +5502,7 @@
                 <w:b w:val="0"/>
                 <w:sz w:val="20"/>
               </w:rPr>
-              <w:t>0.81 (0.65–1.00), P = 0.052</w:t>
+              <w:t>0.81 (0.65–1.02), P = 0.069</w:t>
             </w:r>
           </w:p>
         </w:tc>
@@ -5567,7 +5580,7 @@
                 <w:b w:val="0"/>
                 <w:sz w:val="20"/>
               </w:rPr>
-              <w:t>0.83 (0.66–1.06), P = 0.134</w:t>
+              <w:t>0.85 (0.66–1.08), P = 0.179</w:t>
             </w:r>
           </w:p>
         </w:tc>
@@ -7082,7 +7095,7 @@
                 <w:b w:val="0"/>
                 <w:sz w:val="20"/>
               </w:rPr>
-              <w:t>1.271, 0.017</w:t>
+              <w:t>1.267, 0.018</w:t>
             </w:r>
           </w:p>
         </w:tc>
@@ -7255,7 +7268,7 @@
                 <w:b w:val="0"/>
                 <w:sz w:val="20"/>
               </w:rPr>
-              <w:t>0.800, 0.030</w:t>
+              <w:t>0.801, 0.033</w:t>
             </w:r>
           </w:p>
         </w:tc>
@@ -7428,7 +7441,7 @@
                 <w:b w:val="0"/>
                 <w:sz w:val="20"/>
               </w:rPr>
-              <w:t>1.186, 0.133</w:t>
+              <w:t>1.200, 0.114</w:t>
             </w:r>
           </w:p>
         </w:tc>
@@ -7601,7 +7614,7 @@
                 <w:b w:val="0"/>
                 <w:sz w:val="20"/>
               </w:rPr>
-              <w:t>1.237, 0.058</w:t>
+              <w:t>1.247, 0.050</w:t>
             </w:r>
           </w:p>
         </w:tc>
@@ -7620,7 +7633,7 @@
                 <w:b w:val="0"/>
                 <w:sz w:val="20"/>
               </w:rPr>
-              <w:t>Directionally consistent only</w:t>
+              <w:t>Directionally consistent only (GSE14520 at the significance boundary, 95% CI 1.00–1.55)</w:t>
             </w:r>
           </w:p>
         </w:tc>
@@ -7774,7 +7787,7 @@
                 <w:b w:val="0"/>
                 <w:sz w:val="20"/>
               </w:rPr>
-              <w:t>0.834, 0.134</w:t>
+              <w:t>0.846, 0.179</w:t>
             </w:r>
           </w:p>
         </w:tc>
@@ -7947,7 +7960,7 @@
                 <w:b w:val="0"/>
                 <w:sz w:val="20"/>
               </w:rPr>
-              <w:t>0.807, 0.052</w:t>
+              <w:t>0.815, 0.069</w:t>
             </w:r>
           </w:p>
         </w:tc>
@@ -11272,7 +11285,7 @@
                 <w:b w:val="0"/>
                 <w:sz w:val="20"/>
               </w:rPr>
-              <w:t>1.271 (1.044–1.546)</w:t>
+              <w:t>1.267 (1.041–1.542)</w:t>
             </w:r>
           </w:p>
         </w:tc>
@@ -11291,7 +11304,7 @@
                 <w:b w:val="0"/>
                 <w:sz w:val="20"/>
               </w:rPr>
-              <w:t>0.0167</w:t>
+              <w:t>0.0184</w:t>
             </w:r>
           </w:p>
         </w:tc>
@@ -11369,7 +11382,7 @@
                 <w:b w:val="0"/>
                 <w:sz w:val="20"/>
               </w:rPr>
-              <w:t>3.237 (2.049–5.115)</w:t>
+              <w:t>3.143 (1.980–4.990)</w:t>
             </w:r>
           </w:p>
         </w:tc>
@@ -11388,7 +11401,639 @@
                 <w:b w:val="0"/>
                 <w:sz w:val="20"/>
               </w:rPr>
-              <w:t>4.85 × 10⁻⁷</w:t>
+              <w:t>1.20 × 10⁻⁶</w:t>
+            </w:r>
+          </w:p>
+        </w:tc>
+      </w:tr>
+      <w:tr>
+        <w:tc>
+          <w:tcPr>
+            <w:tcW w:type="dxa" w:w="1872"/>
+          </w:tcPr>
+          <w:p>
+            <w:pPr>
+              <w:spacing w:line="240" w:lineRule="auto" w:after="40"/>
+            </w:pPr>
+            <w:r/>
+            <w:r>
+              <w:rPr>
+                <w:rFonts w:ascii="Times New Roman" w:hAnsi="Times New Roman"/>
+                <w:b w:val="0"/>
+                <w:sz w:val="20"/>
+              </w:rPr>
+              <w:t>GSE14520</w:t>
+            </w:r>
+          </w:p>
+        </w:tc>
+        <w:tc>
+          <w:tcPr>
+            <w:tcW w:type="dxa" w:w="1872"/>
+          </w:tcPr>
+          <w:p>
+            <w:pPr>
+              <w:spacing w:line="240" w:lineRule="auto" w:after="40"/>
+            </w:pPr>
+            <w:r/>
+            <w:r>
+              <w:rPr>
+                <w:rFonts w:ascii="Times New Roman" w:hAnsi="Times New Roman"/>
+                <w:b w:val="0"/>
+                <w:sz w:val="20"/>
+              </w:rPr>
+              <w:t>219 (84)</w:t>
+            </w:r>
+          </w:p>
+        </w:tc>
+        <w:tc>
+          <w:tcPr>
+            <w:tcW w:type="dxa" w:w="1872"/>
+          </w:tcPr>
+          <w:p>
+            <w:pPr>
+              <w:spacing w:line="240" w:lineRule="auto" w:after="40"/>
+            </w:pPr>
+            <w:r/>
+            <w:r>
+              <w:rPr>
+                <w:rFonts w:ascii="Times New Roman" w:hAnsi="Times New Roman"/>
+                <w:b w:val="0"/>
+                <w:sz w:val="20"/>
+              </w:rPr>
+              <w:t>age (per year, centred)</w:t>
+            </w:r>
+          </w:p>
+        </w:tc>
+        <w:tc>
+          <w:tcPr>
+            <w:tcW w:type="dxa" w:w="1872"/>
+          </w:tcPr>
+          <w:p>
+            <w:pPr>
+              <w:spacing w:line="240" w:lineRule="auto" w:after="40"/>
+            </w:pPr>
+            <w:r/>
+            <w:r>
+              <w:rPr>
+                <w:rFonts w:ascii="Times New Roman" w:hAnsi="Times New Roman"/>
+                <w:b w:val="0"/>
+                <w:sz w:val="20"/>
+              </w:rPr>
+              <w:t>0.995 (0.973–1.016)</w:t>
+            </w:r>
+          </w:p>
+        </w:tc>
+        <w:tc>
+          <w:tcPr>
+            <w:tcW w:type="dxa" w:w="1872"/>
+          </w:tcPr>
+          <w:p>
+            <w:pPr>
+              <w:spacing w:line="240" w:lineRule="auto" w:after="40"/>
+            </w:pPr>
+            <w:r/>
+            <w:r>
+              <w:rPr>
+                <w:rFonts w:ascii="Times New Roman" w:hAnsi="Times New Roman"/>
+                <w:b w:val="0"/>
+                <w:sz w:val="20"/>
+              </w:rPr>
+              <w:t>0.611</w:t>
+            </w:r>
+          </w:p>
+        </w:tc>
+      </w:tr>
+      <w:tr>
+        <w:tc>
+          <w:tcPr>
+            <w:tcW w:type="dxa" w:w="1872"/>
+          </w:tcPr>
+          <w:p>
+            <w:pPr>
+              <w:spacing w:line="240" w:lineRule="auto" w:after="40"/>
+            </w:pPr>
+            <w:r/>
+            <w:r>
+              <w:rPr>
+                <w:rFonts w:ascii="Times New Roman" w:hAnsi="Times New Roman"/>
+                <w:b w:val="0"/>
+                <w:sz w:val="20"/>
+              </w:rPr>
+              <w:t>GSE14520</w:t>
+            </w:r>
+          </w:p>
+        </w:tc>
+        <w:tc>
+          <w:tcPr>
+            <w:tcW w:type="dxa" w:w="1872"/>
+          </w:tcPr>
+          <w:p>
+            <w:pPr>
+              <w:spacing w:line="240" w:lineRule="auto" w:after="40"/>
+            </w:pPr>
+            <w:r/>
+            <w:r>
+              <w:rPr>
+                <w:rFonts w:ascii="Times New Roman" w:hAnsi="Times New Roman"/>
+                <w:b w:val="0"/>
+                <w:sz w:val="20"/>
+              </w:rPr>
+              <w:t>219 (84)</w:t>
+            </w:r>
+          </w:p>
+        </w:tc>
+        <w:tc>
+          <w:tcPr>
+            <w:tcW w:type="dxa" w:w="1872"/>
+          </w:tcPr>
+          <w:p>
+            <w:pPr>
+              <w:spacing w:line="240" w:lineRule="auto" w:after="40"/>
+            </w:pPr>
+            <w:r/>
+            <w:r>
+              <w:rPr>
+                <w:rFonts w:ascii="Times New Roman" w:hAnsi="Times New Roman"/>
+                <w:b w:val="0"/>
+                <w:sz w:val="20"/>
+              </w:rPr>
+              <w:t>male</w:t>
+            </w:r>
+          </w:p>
+        </w:tc>
+        <w:tc>
+          <w:tcPr>
+            <w:tcW w:type="dxa" w:w="1872"/>
+          </w:tcPr>
+          <w:p>
+            <w:pPr>
+              <w:spacing w:line="240" w:lineRule="auto" w:after="40"/>
+            </w:pPr>
+            <w:r/>
+            <w:r>
+              <w:rPr>
+                <w:rFonts w:ascii="Times New Roman" w:hAnsi="Times New Roman"/>
+                <w:b w:val="0"/>
+                <w:sz w:val="20"/>
+              </w:rPr>
+              <w:t>1.347 (0.643–2.822)</w:t>
+            </w:r>
+          </w:p>
+        </w:tc>
+        <w:tc>
+          <w:tcPr>
+            <w:tcW w:type="dxa" w:w="1872"/>
+          </w:tcPr>
+          <w:p>
+            <w:pPr>
+              <w:spacing w:line="240" w:lineRule="auto" w:after="40"/>
+            </w:pPr>
+            <w:r/>
+            <w:r>
+              <w:rPr>
+                <w:rFonts w:ascii="Times New Roman" w:hAnsi="Times New Roman"/>
+                <w:b w:val="0"/>
+                <w:sz w:val="20"/>
+              </w:rPr>
+              <w:t>0.430</w:t>
+            </w:r>
+          </w:p>
+        </w:tc>
+      </w:tr>
+    </w:tbl>
+    <w:p>
+      <w:pPr>
+        <w:spacing w:line="240" w:lineRule="auto" w:before="0" w:after="80"/>
+      </w:pPr>
+      <w:r>
+        <w:rPr>
+          <w:rFonts w:ascii="Times New Roman" w:hAnsi="Times New Roman"/>
+          <w:b w:val="0"/>
+          <w:i w:val="0"/>
+          <w:sz w:val="12"/>
+        </w:rPr>
+      </w:r>
+    </w:p>
+    <w:tbl>
+      <w:tblPr>
+        <w:tblStyle w:val="TableGrid"/>
+        <w:tblW w:type="auto" w:w="0"/>
+        <w:jc w:val="center"/>
+        <w:tblLook w:firstColumn="1" w:firstRow="1" w:lastColumn="0" w:lastRow="0" w:noHBand="0" w:noVBand="1" w:val="04A0"/>
+      </w:tblPr>
+      <w:tblGrid>
+        <w:gridCol w:w="3120"/>
+        <w:gridCol w:w="3120"/>
+        <w:gridCol w:w="3120"/>
+      </w:tblGrid>
+      <w:tr>
+        <w:tc>
+          <w:tcPr>
+            <w:tcW w:type="dxa" w:w="3120"/>
+          </w:tcPr>
+          <w:p>
+            <w:pPr>
+              <w:spacing w:line="240" w:lineRule="auto" w:after="40"/>
+            </w:pPr>
+            <w:r/>
+            <w:r>
+              <w:rPr>
+                <w:rFonts w:ascii="Times New Roman" w:hAnsi="Times New Roman"/>
+                <w:b/>
+                <w:sz w:val="20"/>
+              </w:rPr>
+            </w:r>
+          </w:p>
+        </w:tc>
+        <w:tc>
+          <w:tcPr>
+            <w:tcW w:type="dxa" w:w="3120"/>
+          </w:tcPr>
+          <w:p>
+            <w:pPr>
+              <w:spacing w:line="240" w:lineRule="auto" w:after="40"/>
+            </w:pPr>
+            <w:r/>
+            <w:r>
+              <w:rPr>
+                <w:rFonts w:ascii="Times New Roman" w:hAnsi="Times New Roman"/>
+                <w:b/>
+                <w:sz w:val="20"/>
+              </w:rPr>
+              <w:t>TCGA-LIHC</w:t>
+            </w:r>
+          </w:p>
+        </w:tc>
+        <w:tc>
+          <w:tcPr>
+            <w:tcW w:type="dxa" w:w="3120"/>
+          </w:tcPr>
+          <w:p>
+            <w:pPr>
+              <w:spacing w:line="240" w:lineRule="auto" w:after="40"/>
+            </w:pPr>
+            <w:r/>
+            <w:r>
+              <w:rPr>
+                <w:rFonts w:ascii="Times New Roman" w:hAnsi="Times New Roman"/>
+                <w:b/>
+                <w:sz w:val="20"/>
+              </w:rPr>
+              <w:t>GSE14520</w:t>
+            </w:r>
+          </w:p>
+        </w:tc>
+      </w:tr>
+      <w:tr>
+        <w:tc>
+          <w:tcPr>
+            <w:tcW w:type="dxa" w:w="3120"/>
+          </w:tcPr>
+          <w:p>
+            <w:pPr>
+              <w:spacing w:line="240" w:lineRule="auto" w:after="40"/>
+            </w:pPr>
+            <w:r/>
+            <w:r>
+              <w:rPr>
+                <w:rFonts w:ascii="Times New Roman" w:hAnsi="Times New Roman"/>
+                <w:b w:val="0"/>
+                <w:sz w:val="20"/>
+              </w:rPr>
+              <w:t>Samples with expression data</w:t>
+            </w:r>
+          </w:p>
+        </w:tc>
+        <w:tc>
+          <w:tcPr>
+            <w:tcW w:type="dxa" w:w="3120"/>
+          </w:tcPr>
+          <w:p>
+            <w:pPr>
+              <w:spacing w:line="240" w:lineRule="auto" w:after="40"/>
+            </w:pPr>
+            <w:r/>
+            <w:r>
+              <w:rPr>
+                <w:rFonts w:ascii="Times New Roman" w:hAnsi="Times New Roman"/>
+                <w:b w:val="0"/>
+                <w:sz w:val="20"/>
+              </w:rPr>
+              <w:t>424</w:t>
+            </w:r>
+          </w:p>
+        </w:tc>
+        <w:tc>
+          <w:tcPr>
+            <w:tcW w:type="dxa" w:w="3120"/>
+          </w:tcPr>
+          <w:p>
+            <w:pPr>
+              <w:spacing w:line="240" w:lineRule="auto" w:after="40"/>
+            </w:pPr>
+            <w:r/>
+            <w:r>
+              <w:rPr>
+                <w:rFonts w:ascii="Times New Roman" w:hAnsi="Times New Roman"/>
+                <w:b w:val="0"/>
+                <w:sz w:val="20"/>
+              </w:rPr>
+              <w:t>445</w:t>
+            </w:r>
+          </w:p>
+        </w:tc>
+      </w:tr>
+      <w:tr>
+        <w:tc>
+          <w:tcPr>
+            <w:tcW w:type="dxa" w:w="3120"/>
+          </w:tcPr>
+          <w:p>
+            <w:pPr>
+              <w:spacing w:line="240" w:lineRule="auto" w:after="40"/>
+            </w:pPr>
+            <w:r/>
+            <w:r>
+              <w:rPr>
+                <w:rFonts w:ascii="Times New Roman" w:hAnsi="Times New Roman"/>
+                <w:b w:val="0"/>
+                <w:sz w:val="20"/>
+              </w:rPr>
+              <w:t>Samples with survival and covariate data</w:t>
+            </w:r>
+          </w:p>
+        </w:tc>
+        <w:tc>
+          <w:tcPr>
+            <w:tcW w:type="dxa" w:w="3120"/>
+          </w:tcPr>
+          <w:p>
+            <w:pPr>
+              <w:spacing w:line="240" w:lineRule="auto" w:after="40"/>
+            </w:pPr>
+            <w:r/>
+            <w:r>
+              <w:rPr>
+                <w:rFonts w:ascii="Times New Roman" w:hAnsi="Times New Roman"/>
+                <w:b w:val="0"/>
+                <w:sz w:val="20"/>
+              </w:rPr>
+              <w:t>399</w:t>
+            </w:r>
+          </w:p>
+        </w:tc>
+        <w:tc>
+          <w:tcPr>
+            <w:tcW w:type="dxa" w:w="3120"/>
+          </w:tcPr>
+          <w:p>
+            <w:pPr>
+              <w:spacing w:line="240" w:lineRule="auto" w:after="40"/>
+            </w:pPr>
+            <w:r/>
+            <w:r>
+              <w:rPr>
+                <w:rFonts w:ascii="Times New Roman" w:hAnsi="Times New Roman"/>
+                <w:b w:val="0"/>
+                <w:sz w:val="20"/>
+              </w:rPr>
+              <w:t>225</w:t>
+            </w:r>
+          </w:p>
+        </w:tc>
+      </w:tr>
+      <w:tr>
+        <w:tc>
+          <w:tcPr>
+            <w:tcW w:type="dxa" w:w="3120"/>
+          </w:tcPr>
+          <w:p>
+            <w:pPr>
+              <w:spacing w:line="240" w:lineRule="auto" w:after="40"/>
+            </w:pPr>
+            <w:r/>
+            <w:r>
+              <w:rPr>
+                <w:rFonts w:ascii="Times New Roman" w:hAnsi="Times New Roman"/>
+                <w:b w:val="0"/>
+                <w:sz w:val="20"/>
+              </w:rPr>
+              <w:t>Samples entering multivariable models</w:t>
+            </w:r>
+          </w:p>
+        </w:tc>
+        <w:tc>
+          <w:tcPr>
+            <w:tcW w:type="dxa" w:w="3120"/>
+          </w:tcPr>
+          <w:p>
+            <w:pPr>
+              <w:spacing w:line="240" w:lineRule="auto" w:after="40"/>
+            </w:pPr>
+            <w:r/>
+            <w:r>
+              <w:rPr>
+                <w:rFonts w:ascii="Times New Roman" w:hAnsi="Times New Roman"/>
+                <w:b w:val="0"/>
+                <w:sz w:val="20"/>
+              </w:rPr>
+              <w:t>386 (145 events)</w:t>
+            </w:r>
+          </w:p>
+        </w:tc>
+        <w:tc>
+          <w:tcPr>
+            <w:tcW w:type="dxa" w:w="3120"/>
+          </w:tcPr>
+          <w:p>
+            <w:pPr>
+              <w:spacing w:line="240" w:lineRule="auto" w:after="40"/>
+            </w:pPr>
+            <w:r/>
+            <w:r>
+              <w:rPr>
+                <w:rFonts w:ascii="Times New Roman" w:hAnsi="Times New Roman"/>
+                <w:b w:val="0"/>
+                <w:sz w:val="20"/>
+              </w:rPr>
+              <w:t>219 (84 events)</w:t>
+            </w:r>
+          </w:p>
+        </w:tc>
+      </w:tr>
+      <w:tr>
+        <w:tc>
+          <w:tcPr>
+            <w:tcW w:type="dxa" w:w="3120"/>
+          </w:tcPr>
+          <w:p>
+            <w:pPr>
+              <w:spacing w:line="240" w:lineRule="auto" w:after="40"/>
+            </w:pPr>
+            <w:r/>
+            <w:r>
+              <w:rPr>
+                <w:rFonts w:ascii="Times New Roman" w:hAnsi="Times New Roman"/>
+                <w:b w:val="0"/>
+                <w:sz w:val="20"/>
+              </w:rPr>
+              <w:t>Sex, male / female (in models)</w:t>
+            </w:r>
+          </w:p>
+        </w:tc>
+        <w:tc>
+          <w:tcPr>
+            <w:tcW w:type="dxa" w:w="3120"/>
+          </w:tcPr>
+          <w:p>
+            <w:pPr>
+              <w:spacing w:line="240" w:lineRule="auto" w:after="40"/>
+            </w:pPr>
+            <w:r/>
+            <w:r>
+              <w:rPr>
+                <w:rFonts w:ascii="Times New Roman" w:hAnsi="Times New Roman"/>
+                <w:b w:val="0"/>
+                <w:sz w:val="20"/>
+              </w:rPr>
+              <w:t>258 / 128</w:t>
+            </w:r>
+          </w:p>
+        </w:tc>
+        <w:tc>
+          <w:tcPr>
+            <w:tcW w:type="dxa" w:w="3120"/>
+          </w:tcPr>
+          <w:p>
+            <w:pPr>
+              <w:spacing w:line="240" w:lineRule="auto" w:after="40"/>
+            </w:pPr>
+            <w:r/>
+            <w:r>
+              <w:rPr>
+                <w:rFonts w:ascii="Times New Roman" w:hAnsi="Times New Roman"/>
+                <w:b w:val="0"/>
+                <w:sz w:val="20"/>
+              </w:rPr>
+              <w:t>189 / 30</w:t>
+            </w:r>
+          </w:p>
+        </w:tc>
+      </w:tr>
+      <w:tr>
+        <w:tc>
+          <w:tcPr>
+            <w:tcW w:type="dxa" w:w="3120"/>
+          </w:tcPr>
+          <w:p>
+            <w:pPr>
+              <w:spacing w:line="240" w:lineRule="auto" w:after="40"/>
+            </w:pPr>
+            <w:r/>
+            <w:r>
+              <w:rPr>
+                <w:rFonts w:ascii="Times New Roman" w:hAnsi="Times New Roman"/>
+                <w:b w:val="0"/>
+                <w:sz w:val="20"/>
+              </w:rPr>
+              <w:t>Stage I/II / III-IV (in models)</w:t>
+            </w:r>
+          </w:p>
+        </w:tc>
+        <w:tc>
+          <w:tcPr>
+            <w:tcW w:type="dxa" w:w="3120"/>
+          </w:tcPr>
+          <w:p>
+            <w:pPr>
+              <w:spacing w:line="240" w:lineRule="auto" w:after="40"/>
+            </w:pPr>
+            <w:r/>
+            <w:r>
+              <w:rPr>
+                <w:rFonts w:ascii="Times New Roman" w:hAnsi="Times New Roman"/>
+                <w:b w:val="0"/>
+                <w:sz w:val="20"/>
+              </w:rPr>
+              <w:t>190 / 196</w:t>
+            </w:r>
+          </w:p>
+        </w:tc>
+        <w:tc>
+          <w:tcPr>
+            <w:tcW w:type="dxa" w:w="3120"/>
+          </w:tcPr>
+          <w:p>
+            <w:pPr>
+              <w:spacing w:line="240" w:lineRule="auto" w:after="40"/>
+            </w:pPr>
+            <w:r/>
+            <w:r>
+              <w:rPr>
+                <w:rFonts w:ascii="Times New Roman" w:hAnsi="Times New Roman"/>
+                <w:b w:val="0"/>
+                <w:sz w:val="20"/>
+              </w:rPr>
+              <w:t>170 / 49</w:t>
+            </w:r>
+          </w:p>
+        </w:tc>
+      </w:tr>
+      <w:tr>
+        <w:tc>
+          <w:tcPr>
+            <w:tcW w:type="dxa" w:w="3120"/>
+          </w:tcPr>
+          <w:p>
+            <w:pPr>
+              <w:spacing w:line="240" w:lineRule="auto" w:after="40"/>
+            </w:pPr>
+            <w:r/>
+            <w:r>
+              <w:rPr>
+                <w:rFonts w:ascii="Times New Roman" w:hAnsi="Times New Roman"/>
+                <w:b w:val="0"/>
+                <w:sz w:val="20"/>
+              </w:rPr>
+              <w:t>Median age, years (range)</w:t>
+            </w:r>
+          </w:p>
+        </w:tc>
+        <w:tc>
+          <w:tcPr>
+            <w:tcW w:type="dxa" w:w="3120"/>
+          </w:tcPr>
+          <w:p>
+            <w:pPr>
+              <w:spacing w:line="240" w:lineRule="auto" w:after="40"/>
+            </w:pPr>
+            <w:r/>
+            <w:r>
+              <w:rPr>
+                <w:rFonts w:ascii="Times New Roman" w:hAnsi="Times New Roman"/>
+                <w:b w:val="0"/>
+                <w:sz w:val="20"/>
+              </w:rPr>
+              <w:t>61 (16–85)</w:t>
+            </w:r>
+          </w:p>
+        </w:tc>
+        <w:tc>
+          <w:tcPr>
+            <w:tcW w:type="dxa" w:w="3120"/>
+          </w:tcPr>
+          <w:p>
+            <w:pPr>
+              <w:spacing w:line="240" w:lineRule="auto" w:after="40"/>
+            </w:pPr>
+            <w:r/>
+            <w:r>
+              <w:rPr>
+                <w:rFonts w:ascii="Times New Roman" w:hAnsi="Times New Roman"/>
+                <w:b w:val="0"/>
+                <w:sz w:val="20"/>
+              </w:rPr>
+              <w:t>50 (21–77)</w:t>
             </w:r>
           </w:p>
         </w:tc>

</xml_diff>